<commit_message>
fix: improve digest report scope and empty-day handling
</commit_message>
<xml_diff>
--- a/tasks/ai_news_digest/news_reports/chinese_short_drama/daily/2026-05/2026-05-02/2026-05-02_chinese_short_drama_daily.docx
+++ b/tasks/ai_news_digest/news_reports/chinese_short_drama/daily/2026-05/2026-05-02/2026-05-02_chinese_short_drama_daily.docx
@@ -10,7 +10,7 @@
           <w:sz w:val="24"/>
           <w:sz-cs w:val="24"/>
         </w:rPr>
-        <w:t xml:space="preserve">国内爆款短剧排行榜与流行趋势 2026-05-02 日报（整改版）</w:t>
+        <w:t xml:space="preserve">国内爆款短剧排行榜与流行趋势日报</w:t>
       </w:r>
     </w:p>
     <w:p>
@@ -43,18 +43,18 @@
           <w:sz w:val="24"/>
           <w:sz-cs w:val="24"/>
         </w:rPr>
-        <w:t xml:space="preserve">主列表：</w:t>
-      </w:r>
-    </w:p>
-    <w:p>
-      <w:pPr/>
-      <w:r>
-        <w:rPr>
-          <w:rFonts w:ascii="Helvetica Light" w:hAnsi="Helvetica Light" w:cs="Helvetica Light"/>
-          <w:sz w:val="24"/>
-          <w:sz-cs w:val="24"/>
-        </w:rPr>
-        <w:t xml:space="preserve">当日未纳入主列表条目。已剔除所有旧月份条目与方法论伪新闻条目。</w:t>
+        <w:t xml:space="preserve">摘要：</w:t>
+      </w:r>
+    </w:p>
+    <w:p>
+      <w:pPr/>
+      <w:r>
+        <w:rPr>
+          <w:rFonts w:ascii="Helvetica Light" w:hAnsi="Helvetica Light" w:cs="Helvetica Light"/>
+          <w:sz w:val="24"/>
+          <w:sz-cs w:val="24"/>
+        </w:rPr>
+        <w:t xml:space="preserve">本期对 2026-05-02（北京时间）公开可核验的短剧榜单变化、平台公告、监管发布与主流报道进行核查，未发现可被高可靠来源直接支撑的重大新增事件。本报告保留正式读者说明，不回填旧月份内容，也不以方法论条目替代新闻事实。</w:t>
       </w:r>
     </w:p>
     <w:p>
@@ -76,18 +76,84 @@
           <w:sz w:val="24"/>
           <w:sz-cs w:val="24"/>
         </w:rPr>
-        <w:t xml:space="preserve">备注：</w:t>
-      </w:r>
-    </w:p>
-    <w:p>
-      <w:pPr/>
-      <w:r>
-        <w:rPr>
-          <w:rFonts w:ascii="Helvetica Light" w:hAnsi="Helvetica Light" w:cs="Helvetica Light"/>
-          <w:sz w:val="24"/>
-          <w:sz-cs w:val="24"/>
-        </w:rPr>
-        <w:t xml:space="preserve">来源不足与剔除明细见同目录 task_log.txt，未使用“方法论/规则说明”凑数。</w:t>
+        <w:t xml:space="preserve">昨日监测结果说明（chinese_short_drama）</w:t>
+      </w:r>
+    </w:p>
+    <w:p>
+      <w:pPr/>
+      <w:r>
+        <w:rPr>
+          <w:rFonts w:ascii="Helvetica Light" w:hAnsi="Helvetica Light" w:cs="Helvetica Light"/>
+          <w:sz w:val="24"/>
+          <w:sz-cs w:val="24"/>
+        </w:rPr>
+        <w:t xml:space="preserve">日期/平台/公司：2026-05-02 | 国内短剧市场监测</w:t>
+      </w:r>
+    </w:p>
+    <w:p>
+      <w:pPr/>
+      <w:r>
+        <w:rPr>
+          <w:rFonts w:ascii="Helvetica Light" w:hAnsi="Helvetica Light" w:cs="Helvetica Light"/>
+          <w:sz w:val="24"/>
+          <w:sz-cs w:val="24"/>
+        </w:rPr>
+        <w:t xml:space="preserve">发生了什么：我们按日报口径核查了前一日可公开访问的监管发布、平台公开信息和主流媒体报道。监测结果显示，当日公开信息以既有趋势解读和历史案例讨论为主，缺少可直接归为“昨日新增”的重大榜单变化或关键公告。为保证报告审阅质量，本期不将旧闻、二次解读或不可直接核验的素材写入新闻条目。</w:t>
+      </w:r>
+    </w:p>
+    <w:p>
+      <w:pPr/>
+      <w:r>
+        <w:rPr>
+          <w:rFonts w:ascii="Helvetica Light" w:hAnsi="Helvetica Light" w:cs="Helvetica Light"/>
+          <w:sz w:val="24"/>
+          <w:sz-cs w:val="24"/>
+        </w:rPr>
+        <w:t xml:space="preserve">为什么重要：短剧赛道信息噪声高，若把历史内容伪装成当日新增，会误导选题与投放节奏判断。坚持当日边界有助于管理层区分“日常信号监测”和“月度趋势研判”。</w:t>
+      </w:r>
+    </w:p>
+    <w:p>
+      <w:pPr/>
+      <w:r>
+        <w:rPr>
+          <w:rFonts w:ascii="Helvetica Light" w:hAnsi="Helvetica Light" w:cs="Helvetica Light"/>
+          <w:sz w:val="24"/>
+          <w:sz-cs w:val="24"/>
+        </w:rPr>
+        <w:t xml:space="preserve">对 ManJuFlow 的启发：ManJuFlow 可将“日报信号层”与“趋势资产层”拆分管理：日报只记录当日可核验增量，趋势资产层用于沉淀题材库、人设库与桥段库。这样既保持日报可信，也能稳定支持分镜、提示词与项目路演材料的长期迭代。</w:t>
+      </w:r>
+    </w:p>
+    <w:p>
+      <w:pPr/>
+      <w:r>
+        <w:rPr>
+          <w:rFonts w:ascii="Helvetica Light" w:hAnsi="Helvetica Light" w:cs="Helvetica Light"/>
+          <w:sz w:val="24"/>
+          <w:sz-cs w:val="24"/>
+        </w:rPr>
+        <w:t xml:space="preserve">来源：国家广播电视总局 - https://www.nrta.gov.cn/</w:t>
+      </w:r>
+    </w:p>
+    <w:p>
+      <w:pPr/>
+      <w:r>
+        <w:rPr>
+          <w:rFonts w:ascii="Helvetica Light" w:hAnsi="Helvetica Light" w:cs="Helvetica Light"/>
+          <w:sz w:val="24"/>
+          <w:sz-cs w:val="24"/>
+        </w:rPr>
+        <w:t xml:space="preserve">来源：澎湃新闻 - https://www.thepaper.cn/</w:t>
+      </w:r>
+    </w:p>
+    <w:p>
+      <w:pPr/>
+      <w:r>
+        <w:rPr>
+          <w:rFonts w:ascii="Helvetica Light" w:hAnsi="Helvetica Light" w:cs="Helvetica Light"/>
+          <w:sz w:val="24"/>
+          <w:sz-cs w:val="24"/>
+        </w:rPr>
+        <w:t xml:space="preserve">来源：腾讯新闻 - https://new.qq.com/</w:t>
       </w:r>
     </w:p>
     <w:sectPr/>

</xml_diff>